<commit_message>
Andrew | First draft of requirements.
</commit_message>
<xml_diff>
--- a/compliance/Comprehensive Requirements.docx
+++ b/compliance/Comprehensive Requirements.docx
@@ -14,6 +14,13 @@
           <w:iCs/>
         </w:rPr>
         <w:t>Comprehensive Requirements that Apply to all Use Cases</w:t>
+      </w:r>
+      <w:r>
+        <w:rPr>
+          <w:i/>
+          <w:iCs/>
+        </w:rPr>
+        <w:t xml:space="preserve"> </w:t>
       </w:r>
     </w:p>
     <w:tbl>
@@ -282,15 +289,7 @@
               <w:spacing w:line="480" w:lineRule="auto"/>
             </w:pPr>
             <w:r>
-              <w:t xml:space="preserve">One </w:t>
-            </w:r>
-            <w:proofErr w:type="spellStart"/>
-            <w:r>
-              <w:t>orderer</w:t>
-            </w:r>
-            <w:proofErr w:type="spellEnd"/>
-            <w:r>
-              <w:t xml:space="preserve"> node.</w:t>
+              <w:t>One orderer node.</w:t>
             </w:r>
           </w:p>
         </w:tc>
@@ -453,108 +452,79 @@
               <w:spacing w:line="480" w:lineRule="auto"/>
             </w:pPr>
             <w:r>
-              <w:t>0.</w:t>
-            </w:r>
-            <w:r>
-              <w:t>6</w:t>
-            </w:r>
-          </w:p>
-        </w:tc>
-        <w:tc>
-          <w:tcPr>
-            <w:tcW w:w="8180" w:type="dxa"/>
-            <w:tcBorders>
-              <w:top w:val="nil"/>
-              <w:bottom w:val="nil"/>
-            </w:tcBorders>
-          </w:tcPr>
-          <w:p>
-            <w:pPr>
-              <w:spacing w:line="480" w:lineRule="auto"/>
-            </w:pPr>
-            <w:r>
-              <w:t xml:space="preserve">The </w:t>
-            </w:r>
-            <w:r>
-              <w:t>state</w:t>
-            </w:r>
-            <w:r>
-              <w:t xml:space="preserve"> government must provide:</w:t>
-            </w:r>
-          </w:p>
-        </w:tc>
-      </w:tr>
-      <w:tr>
-        <w:tc>
-          <w:tcPr>
-            <w:tcW w:w="1170" w:type="dxa"/>
-            <w:tcBorders>
-              <w:top w:val="nil"/>
-              <w:bottom w:val="nil"/>
-            </w:tcBorders>
-          </w:tcPr>
-          <w:p>
-            <w:pPr>
-              <w:spacing w:line="480" w:lineRule="auto"/>
-            </w:pPr>
-            <w:r>
-              <w:t>0.</w:t>
-            </w:r>
-            <w:r>
-              <w:t>6</w:t>
-            </w:r>
-            <w:r>
-              <w:t>.1</w:t>
-            </w:r>
-          </w:p>
-        </w:tc>
-        <w:tc>
-          <w:tcPr>
-            <w:tcW w:w="8180" w:type="dxa"/>
-            <w:tcBorders>
-              <w:top w:val="nil"/>
-              <w:bottom w:val="nil"/>
-            </w:tcBorders>
-          </w:tcPr>
-          <w:p>
-            <w:pPr>
-              <w:spacing w:line="480" w:lineRule="auto"/>
-            </w:pPr>
-            <w:r>
-              <w:t xml:space="preserve">One </w:t>
-            </w:r>
-            <w:proofErr w:type="spellStart"/>
-            <w:r>
-              <w:t>orderer</w:t>
-            </w:r>
-            <w:proofErr w:type="spellEnd"/>
-            <w:r>
-              <w:t xml:space="preserve"> node.</w:t>
-            </w:r>
-          </w:p>
-        </w:tc>
-      </w:tr>
-      <w:tr>
-        <w:tc>
-          <w:tcPr>
-            <w:tcW w:w="1170" w:type="dxa"/>
-            <w:tcBorders>
-              <w:top w:val="nil"/>
-              <w:bottom w:val="nil"/>
-            </w:tcBorders>
-          </w:tcPr>
-          <w:p>
-            <w:pPr>
-              <w:spacing w:line="480" w:lineRule="auto"/>
-            </w:pPr>
-            <w:r>
-              <w:t>0.</w:t>
-            </w:r>
-            <w:r>
-              <w:t>6</w:t>
-            </w:r>
-            <w:r>
-              <w:t>.2</w:t>
+              <w:t>0.6</w:t>
+            </w:r>
+          </w:p>
+        </w:tc>
+        <w:tc>
+          <w:tcPr>
+            <w:tcW w:w="8180" w:type="dxa"/>
+            <w:tcBorders>
+              <w:top w:val="nil"/>
+              <w:bottom w:val="nil"/>
+            </w:tcBorders>
+          </w:tcPr>
+          <w:p>
+            <w:pPr>
+              <w:spacing w:line="480" w:lineRule="auto"/>
+            </w:pPr>
+            <w:r>
+              <w:t>The state government must provide:</w:t>
+            </w:r>
+          </w:p>
+        </w:tc>
+      </w:tr>
+      <w:tr>
+        <w:tc>
+          <w:tcPr>
+            <w:tcW w:w="1170" w:type="dxa"/>
+            <w:tcBorders>
+              <w:top w:val="nil"/>
+              <w:bottom w:val="nil"/>
+            </w:tcBorders>
+          </w:tcPr>
+          <w:p>
+            <w:pPr>
+              <w:spacing w:line="480" w:lineRule="auto"/>
+            </w:pPr>
+            <w:r>
+              <w:t>0.6.1</w:t>
+            </w:r>
+          </w:p>
+        </w:tc>
+        <w:tc>
+          <w:tcPr>
+            <w:tcW w:w="8180" w:type="dxa"/>
+            <w:tcBorders>
+              <w:top w:val="nil"/>
+              <w:bottom w:val="nil"/>
+            </w:tcBorders>
+          </w:tcPr>
+          <w:p>
+            <w:pPr>
+              <w:spacing w:line="480" w:lineRule="auto"/>
+            </w:pPr>
+            <w:r>
+              <w:t>One orderer node.</w:t>
+            </w:r>
+          </w:p>
+        </w:tc>
+      </w:tr>
+      <w:tr>
+        <w:tc>
+          <w:tcPr>
+            <w:tcW w:w="1170" w:type="dxa"/>
+            <w:tcBorders>
+              <w:top w:val="nil"/>
+              <w:bottom w:val="nil"/>
+            </w:tcBorders>
+          </w:tcPr>
+          <w:p>
+            <w:pPr>
+              <w:spacing w:line="480" w:lineRule="auto"/>
+            </w:pPr>
+            <w:r>
+              <w:t>0.6.2</w:t>
             </w:r>
           </w:p>
         </w:tc>
@@ -590,13 +560,7 @@
               <w:spacing w:line="480" w:lineRule="auto"/>
             </w:pPr>
             <w:r>
-              <w:t>0.</w:t>
-            </w:r>
-            <w:r>
-              <w:t>6</w:t>
-            </w:r>
-            <w:r>
-              <w:t>.3</w:t>
+              <w:t>0.6.3</w:t>
             </w:r>
           </w:p>
         </w:tc>
@@ -632,13 +596,7 @@
               <w:spacing w:line="480" w:lineRule="auto"/>
             </w:pPr>
             <w:r>
-              <w:t>0.</w:t>
-            </w:r>
-            <w:r>
-              <w:t>6</w:t>
-            </w:r>
-            <w:r>
-              <w:t>.4</w:t>
+              <w:t>0.6.4</w:t>
             </w:r>
           </w:p>
         </w:tc>
@@ -674,13 +632,7 @@
               <w:spacing w:line="480" w:lineRule="auto"/>
             </w:pPr>
             <w:r>
-              <w:t>0.</w:t>
-            </w:r>
-            <w:r>
-              <w:t>6</w:t>
-            </w:r>
-            <w:r>
-              <w:t>.5</w:t>
+              <w:t>0.6.5</w:t>
             </w:r>
           </w:p>
         </w:tc>
@@ -716,105 +668,79 @@
               <w:spacing w:line="480" w:lineRule="auto"/>
             </w:pPr>
             <w:r>
-              <w:t>0.</w:t>
-            </w:r>
-            <w:r>
-              <w:t>7</w:t>
-            </w:r>
-          </w:p>
-        </w:tc>
-        <w:tc>
-          <w:tcPr>
-            <w:tcW w:w="8180" w:type="dxa"/>
-            <w:tcBorders>
-              <w:top w:val="nil"/>
-              <w:bottom w:val="nil"/>
-            </w:tcBorders>
-          </w:tcPr>
-          <w:p>
-            <w:pPr>
-              <w:spacing w:line="480" w:lineRule="auto"/>
-            </w:pPr>
-            <w:r>
-              <w:t>Each manufacturer</w:t>
-            </w:r>
-            <w:r>
-              <w:t xml:space="preserve"> must provide:</w:t>
-            </w:r>
-          </w:p>
-        </w:tc>
-      </w:tr>
-      <w:tr>
-        <w:tc>
-          <w:tcPr>
-            <w:tcW w:w="1170" w:type="dxa"/>
-            <w:tcBorders>
-              <w:top w:val="nil"/>
-              <w:bottom w:val="nil"/>
-            </w:tcBorders>
-          </w:tcPr>
-          <w:p>
-            <w:pPr>
-              <w:spacing w:line="480" w:lineRule="auto"/>
-            </w:pPr>
-            <w:r>
-              <w:t>0.</w:t>
-            </w:r>
-            <w:r>
-              <w:t>7</w:t>
-            </w:r>
-            <w:r>
-              <w:t>.1</w:t>
-            </w:r>
-          </w:p>
-        </w:tc>
-        <w:tc>
-          <w:tcPr>
-            <w:tcW w:w="8180" w:type="dxa"/>
-            <w:tcBorders>
-              <w:top w:val="nil"/>
-              <w:bottom w:val="nil"/>
-            </w:tcBorders>
-          </w:tcPr>
-          <w:p>
-            <w:pPr>
-              <w:spacing w:line="480" w:lineRule="auto"/>
-            </w:pPr>
-            <w:r>
-              <w:t xml:space="preserve">One </w:t>
-            </w:r>
-            <w:proofErr w:type="spellStart"/>
-            <w:r>
-              <w:t>orderer</w:t>
-            </w:r>
-            <w:proofErr w:type="spellEnd"/>
-            <w:r>
-              <w:t xml:space="preserve"> node.</w:t>
-            </w:r>
-          </w:p>
-        </w:tc>
-      </w:tr>
-      <w:tr>
-        <w:tc>
-          <w:tcPr>
-            <w:tcW w:w="1170" w:type="dxa"/>
-            <w:tcBorders>
-              <w:top w:val="nil"/>
-              <w:bottom w:val="nil"/>
-            </w:tcBorders>
-          </w:tcPr>
-          <w:p>
-            <w:pPr>
-              <w:spacing w:line="480" w:lineRule="auto"/>
-            </w:pPr>
-            <w:r>
-              <w:t>0.</w:t>
-            </w:r>
-            <w:r>
-              <w:t>7</w:t>
-            </w:r>
-            <w:r>
-              <w:t>.2</w:t>
+              <w:t>0.7</w:t>
+            </w:r>
+          </w:p>
+        </w:tc>
+        <w:tc>
+          <w:tcPr>
+            <w:tcW w:w="8180" w:type="dxa"/>
+            <w:tcBorders>
+              <w:top w:val="nil"/>
+              <w:bottom w:val="nil"/>
+            </w:tcBorders>
+          </w:tcPr>
+          <w:p>
+            <w:pPr>
+              <w:spacing w:line="480" w:lineRule="auto"/>
+            </w:pPr>
+            <w:r>
+              <w:t>Each manufacturer must provide:</w:t>
+            </w:r>
+          </w:p>
+        </w:tc>
+      </w:tr>
+      <w:tr>
+        <w:tc>
+          <w:tcPr>
+            <w:tcW w:w="1170" w:type="dxa"/>
+            <w:tcBorders>
+              <w:top w:val="nil"/>
+              <w:bottom w:val="nil"/>
+            </w:tcBorders>
+          </w:tcPr>
+          <w:p>
+            <w:pPr>
+              <w:spacing w:line="480" w:lineRule="auto"/>
+            </w:pPr>
+            <w:r>
+              <w:t>0.7.1</w:t>
+            </w:r>
+          </w:p>
+        </w:tc>
+        <w:tc>
+          <w:tcPr>
+            <w:tcW w:w="8180" w:type="dxa"/>
+            <w:tcBorders>
+              <w:top w:val="nil"/>
+              <w:bottom w:val="nil"/>
+            </w:tcBorders>
+          </w:tcPr>
+          <w:p>
+            <w:pPr>
+              <w:spacing w:line="480" w:lineRule="auto"/>
+            </w:pPr>
+            <w:r>
+              <w:t>One orderer node.</w:t>
+            </w:r>
+          </w:p>
+        </w:tc>
+      </w:tr>
+      <w:tr>
+        <w:tc>
+          <w:tcPr>
+            <w:tcW w:w="1170" w:type="dxa"/>
+            <w:tcBorders>
+              <w:top w:val="nil"/>
+              <w:bottom w:val="nil"/>
+            </w:tcBorders>
+          </w:tcPr>
+          <w:p>
+            <w:pPr>
+              <w:spacing w:line="480" w:lineRule="auto"/>
+            </w:pPr>
+            <w:r>
+              <w:t>0.7.2</w:t>
             </w:r>
           </w:p>
         </w:tc>
@@ -850,13 +776,7 @@
               <w:spacing w:line="480" w:lineRule="auto"/>
             </w:pPr>
             <w:r>
-              <w:t>0.</w:t>
-            </w:r>
-            <w:r>
-              <w:t>7</w:t>
-            </w:r>
-            <w:r>
-              <w:t>.3</w:t>
+              <w:t>0.7.3</w:t>
             </w:r>
           </w:p>
         </w:tc>
@@ -892,13 +812,7 @@
               <w:spacing w:line="480" w:lineRule="auto"/>
             </w:pPr>
             <w:r>
-              <w:t>0.</w:t>
-            </w:r>
-            <w:r>
-              <w:t>7</w:t>
-            </w:r>
-            <w:r>
-              <w:t>.4</w:t>
+              <w:t>0.7.4</w:t>
             </w:r>
           </w:p>
         </w:tc>
@@ -935,13 +849,7 @@
             </w:pPr>
             <w:r>
               <w:lastRenderedPageBreak/>
-              <w:t>0.</w:t>
-            </w:r>
-            <w:r>
-              <w:t>7</w:t>
-            </w:r>
-            <w:r>
-              <w:t>.5</w:t>
+              <w:t>0.7.5</w:t>
             </w:r>
           </w:p>
         </w:tc>
@@ -1502,15 +1410,7 @@
               <w:spacing w:line="480" w:lineRule="auto"/>
             </w:pPr>
             <w:r>
-              <w:t xml:space="preserve">The </w:t>
-            </w:r>
-            <w:proofErr w:type="spellStart"/>
-            <w:r>
-              <w:t>chaincode</w:t>
-            </w:r>
-            <w:proofErr w:type="spellEnd"/>
-            <w:r>
-              <w:t xml:space="preserve"> must ensure the following:</w:t>
+              <w:t>The chaincode must ensure the following:</w:t>
             </w:r>
           </w:p>
         </w:tc>
@@ -2139,15 +2039,7 @@
               <w:spacing w:line="480" w:lineRule="auto"/>
             </w:pPr>
             <w:r>
-              <w:t xml:space="preserve">The </w:t>
-            </w:r>
-            <w:proofErr w:type="spellStart"/>
-            <w:r>
-              <w:t>chaincode</w:t>
-            </w:r>
-            <w:proofErr w:type="spellEnd"/>
-            <w:r>
-              <w:t xml:space="preserve"> must:</w:t>
+              <w:t>The chaincode must:</w:t>
             </w:r>
           </w:p>
         </w:tc>

</xml_diff>

<commit_message>
Andrew | Created the firmware chaincode. Added the firmware JSON schema. Updated the firmware updates comprehensie requirements.
</commit_message>
<xml_diff>
--- a/compliance/Comprehensive Requirements.docx
+++ b/compliance/Comprehensive Requirements.docx
@@ -1194,7 +1194,10 @@
               <w:spacing w:line="480" w:lineRule="auto"/>
             </w:pPr>
             <w:r>
-              <w:t>A unique identifier for the firmware. The identifier must be unique to the manufacturer.</w:t>
+              <w:t>The make of the vehicle</w:t>
+            </w:r>
+            <w:r>
+              <w:t>.</w:t>
             </w:r>
           </w:p>
         </w:tc>
@@ -1230,6 +1233,45 @@
               <w:spacing w:line="480" w:lineRule="auto"/>
             </w:pPr>
             <w:r>
+              <w:t>The model of the vehicle.</w:t>
+            </w:r>
+          </w:p>
+        </w:tc>
+      </w:tr>
+      <w:tr>
+        <w:tc>
+          <w:tcPr>
+            <w:tcW w:w="1170" w:type="dxa"/>
+            <w:tcBorders>
+              <w:top w:val="nil"/>
+              <w:bottom w:val="nil"/>
+            </w:tcBorders>
+          </w:tcPr>
+          <w:p>
+            <w:pPr>
+              <w:spacing w:line="480" w:lineRule="auto"/>
+            </w:pPr>
+            <w:r>
+              <w:t>1.5.</w:t>
+            </w:r>
+            <w:r>
+              <w:t>4</w:t>
+            </w:r>
+          </w:p>
+        </w:tc>
+        <w:tc>
+          <w:tcPr>
+            <w:tcW w:w="8180" w:type="dxa"/>
+            <w:tcBorders>
+              <w:top w:val="nil"/>
+              <w:bottom w:val="nil"/>
+            </w:tcBorders>
+          </w:tcPr>
+          <w:p>
+            <w:pPr>
+              <w:spacing w:line="480" w:lineRule="auto"/>
+            </w:pPr>
+            <w:r>
               <w:t>The URL where the artifact is stored.</w:t>
             </w:r>
           </w:p>
@@ -1249,7 +1291,10 @@
               <w:spacing w:line="480" w:lineRule="auto"/>
             </w:pPr>
             <w:r>
-              <w:t>1.5.4</w:t>
+              <w:t>1.5.</w:t>
+            </w:r>
+            <w:r>
+              <w:t>5</w:t>
             </w:r>
           </w:p>
         </w:tc>
@@ -1285,7 +1330,10 @@
               <w:spacing w:line="480" w:lineRule="auto"/>
             </w:pPr>
             <w:r>
-              <w:t>1.5.5</w:t>
+              <w:t>1.5.</w:t>
+            </w:r>
+            <w:r>
+              <w:t>6</w:t>
             </w:r>
           </w:p>
         </w:tc>
@@ -1321,6 +1369,42 @@
               <w:spacing w:line="480" w:lineRule="auto"/>
             </w:pPr>
             <w:r>
+              <w:t>1.5.7</w:t>
+            </w:r>
+          </w:p>
+        </w:tc>
+        <w:tc>
+          <w:tcPr>
+            <w:tcW w:w="8180" w:type="dxa"/>
+            <w:tcBorders>
+              <w:top w:val="nil"/>
+              <w:bottom w:val="nil"/>
+            </w:tcBorders>
+          </w:tcPr>
+          <w:p>
+            <w:pPr>
+              <w:spacing w:line="480" w:lineRule="auto"/>
+            </w:pPr>
+            <w:r>
+              <w:t>The year of the vehicle.</w:t>
+            </w:r>
+          </w:p>
+        </w:tc>
+      </w:tr>
+      <w:tr>
+        <w:tc>
+          <w:tcPr>
+            <w:tcW w:w="1170" w:type="dxa"/>
+            <w:tcBorders>
+              <w:top w:val="nil"/>
+              <w:bottom w:val="nil"/>
+            </w:tcBorders>
+          </w:tcPr>
+          <w:p>
+            <w:pPr>
+              <w:spacing w:line="480" w:lineRule="auto"/>
+            </w:pPr>
+            <w:r>
               <w:t>1.6</w:t>
             </w:r>
           </w:p>
@@ -1465,6 +1549,7 @@
               <w:spacing w:line="480" w:lineRule="auto"/>
             </w:pPr>
             <w:r>
+              <w:lastRenderedPageBreak/>
               <w:t>1.9.1.1</w:t>
             </w:r>
           </w:p>
@@ -1501,7 +1586,6 @@
               <w:spacing w:line="480" w:lineRule="auto"/>
             </w:pPr>
             <w:r>
-              <w:lastRenderedPageBreak/>
               <w:t>1.9.2</w:t>
             </w:r>
           </w:p>

</xml_diff>

<commit_message>
Andrew | Added schema. Updated requirements.
</commit_message>
<xml_diff>
--- a/compliance/Comprehensive Requirements.docx
+++ b/compliance/Comprehensive Requirements.docx
@@ -289,7 +289,15 @@
               <w:spacing w:line="480" w:lineRule="auto"/>
             </w:pPr>
             <w:r>
-              <w:t>One orderer node.</w:t>
+              <w:t xml:space="preserve">One </w:t>
+            </w:r>
+            <w:proofErr w:type="spellStart"/>
+            <w:r>
+              <w:t>orderer</w:t>
+            </w:r>
+            <w:proofErr w:type="spellEnd"/>
+            <w:r>
+              <w:t xml:space="preserve"> node.</w:t>
             </w:r>
           </w:p>
         </w:tc>
@@ -505,7 +513,15 @@
               <w:spacing w:line="480" w:lineRule="auto"/>
             </w:pPr>
             <w:r>
-              <w:t>One orderer node.</w:t>
+              <w:t xml:space="preserve">One </w:t>
+            </w:r>
+            <w:proofErr w:type="spellStart"/>
+            <w:r>
+              <w:t>orderer</w:t>
+            </w:r>
+            <w:proofErr w:type="spellEnd"/>
+            <w:r>
+              <w:t xml:space="preserve"> node.</w:t>
             </w:r>
           </w:p>
         </w:tc>
@@ -721,7 +737,15 @@
               <w:spacing w:line="480" w:lineRule="auto"/>
             </w:pPr>
             <w:r>
-              <w:t>One orderer node.</w:t>
+              <w:t xml:space="preserve">One </w:t>
+            </w:r>
+            <w:proofErr w:type="spellStart"/>
+            <w:r>
+              <w:t>orderer</w:t>
+            </w:r>
+            <w:proofErr w:type="spellEnd"/>
+            <w:r>
+              <w:t xml:space="preserve"> node.</w:t>
             </w:r>
           </w:p>
         </w:tc>
@@ -1494,7 +1518,15 @@
               <w:spacing w:line="480" w:lineRule="auto"/>
             </w:pPr>
             <w:r>
-              <w:t>The chaincode must ensure the following:</w:t>
+              <w:t xml:space="preserve">The </w:t>
+            </w:r>
+            <w:proofErr w:type="spellStart"/>
+            <w:r>
+              <w:t>chaincode</w:t>
+            </w:r>
+            <w:proofErr w:type="spellEnd"/>
+            <w:r>
+              <w:t xml:space="preserve"> must ensure the following:</w:t>
             </w:r>
           </w:p>
         </w:tc>
@@ -2123,7 +2155,15 @@
               <w:spacing w:line="480" w:lineRule="auto"/>
             </w:pPr>
             <w:r>
-              <w:t>The chaincode must:</w:t>
+              <w:t xml:space="preserve">The </w:t>
+            </w:r>
+            <w:proofErr w:type="spellStart"/>
+            <w:r>
+              <w:t>chaincode</w:t>
+            </w:r>
+            <w:proofErr w:type="spellEnd"/>
+            <w:r>
+              <w:t xml:space="preserve"> must:</w:t>
             </w:r>
           </w:p>
         </w:tc>
@@ -3002,7 +3042,15 @@
               <w:spacing w:line="480" w:lineRule="auto"/>
             </w:pPr>
             <w:r>
-              <w:t>The chaincode must:</w:t>
+              <w:t xml:space="preserve">The </w:t>
+            </w:r>
+            <w:proofErr w:type="spellStart"/>
+            <w:r>
+              <w:t>chaincode</w:t>
+            </w:r>
+            <w:proofErr w:type="spellEnd"/>
+            <w:r>
+              <w:t xml:space="preserve"> must:</w:t>
             </w:r>
           </w:p>
         </w:tc>
@@ -3766,7 +3814,15 @@
               <w:spacing w:line="480" w:lineRule="auto"/>
             </w:pPr>
             <w:r>
-              <w:t>The chaincode must:</w:t>
+              <w:t xml:space="preserve">The </w:t>
+            </w:r>
+            <w:proofErr w:type="spellStart"/>
+            <w:r>
+              <w:t>chaincode</w:t>
+            </w:r>
+            <w:proofErr w:type="spellEnd"/>
+            <w:r>
+              <w:t xml:space="preserve"> must:</w:t>
             </w:r>
           </w:p>
         </w:tc>
@@ -4239,7 +4295,15 @@
               <w:spacing w:line="480" w:lineRule="auto"/>
             </w:pPr>
             <w:r>
-              <w:t>The chaincode must ensure the following:</w:t>
+              <w:t xml:space="preserve">The </w:t>
+            </w:r>
+            <w:proofErr w:type="spellStart"/>
+            <w:r>
+              <w:t>chaincode</w:t>
+            </w:r>
+            <w:proofErr w:type="spellEnd"/>
+            <w:r>
+              <w:t xml:space="preserve"> must ensure the following:</w:t>
             </w:r>
           </w:p>
         </w:tc>
@@ -5114,7 +5178,15 @@
               <w:spacing w:line="480" w:lineRule="auto"/>
             </w:pPr>
             <w:r>
-              <w:t>The chaincode must:</w:t>
+              <w:t xml:space="preserve">The </w:t>
+            </w:r>
+            <w:proofErr w:type="spellStart"/>
+            <w:r>
+              <w:t>chaincode</w:t>
+            </w:r>
+            <w:proofErr w:type="spellEnd"/>
+            <w:r>
+              <w:t xml:space="preserve"> must:</w:t>
             </w:r>
           </w:p>
         </w:tc>
@@ -5631,35 +5703,10 @@
               <w:spacing w:line="480" w:lineRule="auto"/>
             </w:pPr>
             <w:r>
-              <w:t>5.4</w:t>
-            </w:r>
-          </w:p>
-        </w:tc>
-        <w:tc>
-          <w:tcPr>
-            <w:tcW w:w="8180" w:type="dxa"/>
-          </w:tcPr>
-          <w:p>
-            <w:pPr>
-              <w:spacing w:line="480" w:lineRule="auto"/>
-            </w:pPr>
-            <w:r>
-              <w:t>The architecture must support a generic way of handling bonds.</w:t>
-            </w:r>
-          </w:p>
-        </w:tc>
-      </w:tr>
-      <w:tr>
-        <w:tc>
-          <w:tcPr>
-            <w:tcW w:w="1170" w:type="dxa"/>
-          </w:tcPr>
-          <w:p>
-            <w:pPr>
-              <w:spacing w:line="480" w:lineRule="auto"/>
-            </w:pPr>
-            <w:r>
-              <w:t>5.5</w:t>
+              <w:t>5.</w:t>
+            </w:r>
+            <w:r>
+              <w:t>4</w:t>
             </w:r>
           </w:p>
         </w:tc>
@@ -5687,7 +5734,13 @@
               <w:spacing w:line="480" w:lineRule="auto"/>
             </w:pPr>
             <w:r>
-              <w:t>5.5.1</w:t>
+              <w:t>5.</w:t>
+            </w:r>
+            <w:r>
+              <w:t>4</w:t>
+            </w:r>
+            <w:r>
+              <w:t>.1</w:t>
             </w:r>
           </w:p>
         </w:tc>
@@ -5715,7 +5768,13 @@
               <w:spacing w:line="480" w:lineRule="auto"/>
             </w:pPr>
             <w:r>
-              <w:t>5.5.2</w:t>
+              <w:t>5.</w:t>
+            </w:r>
+            <w:r>
+              <w:t>4</w:t>
+            </w:r>
+            <w:r>
+              <w:t>.2</w:t>
             </w:r>
           </w:p>
         </w:tc>
@@ -5743,7 +5802,13 @@
               <w:spacing w:line="480" w:lineRule="auto"/>
             </w:pPr>
             <w:r>
-              <w:t>5.5.3</w:t>
+              <w:t>5.</w:t>
+            </w:r>
+            <w:r>
+              <w:t>4</w:t>
+            </w:r>
+            <w:r>
+              <w:t>.3</w:t>
             </w:r>
           </w:p>
         </w:tc>
@@ -5771,7 +5836,13 @@
               <w:spacing w:line="480" w:lineRule="auto"/>
             </w:pPr>
             <w:r>
-              <w:t>5.5.4</w:t>
+              <w:t>5.</w:t>
+            </w:r>
+            <w:r>
+              <w:t>4</w:t>
+            </w:r>
+            <w:r>
+              <w:t>.4</w:t>
             </w:r>
           </w:p>
         </w:tc>
@@ -5799,7 +5870,13 @@
               <w:spacing w:line="480" w:lineRule="auto"/>
             </w:pPr>
             <w:r>
-              <w:t>5.5.5</w:t>
+              <w:t>5.</w:t>
+            </w:r>
+            <w:r>
+              <w:t>4</w:t>
+            </w:r>
+            <w:r>
+              <w:t>.5</w:t>
             </w:r>
           </w:p>
         </w:tc>
@@ -5827,7 +5904,10 @@
               <w:spacing w:line="480" w:lineRule="auto"/>
             </w:pPr>
             <w:r>
-              <w:t>5.6</w:t>
+              <w:t>5.</w:t>
+            </w:r>
+            <w:r>
+              <w:t>5</w:t>
             </w:r>
           </w:p>
         </w:tc>
@@ -5855,7 +5935,10 @@
               <w:spacing w:line="480" w:lineRule="auto"/>
             </w:pPr>
             <w:r>
-              <w:t>5.7</w:t>
+              <w:t>5.</w:t>
+            </w:r>
+            <w:r>
+              <w:t>6</w:t>
             </w:r>
           </w:p>
         </w:tc>
@@ -5883,7 +5966,10 @@
               <w:spacing w:line="480" w:lineRule="auto"/>
             </w:pPr>
             <w:r>
-              <w:t>5.8</w:t>
+              <w:t>5.</w:t>
+            </w:r>
+            <w:r>
+              <w:t>7</w:t>
             </w:r>
           </w:p>
         </w:tc>
@@ -5911,36 +5997,48 @@
               <w:spacing w:line="480" w:lineRule="auto"/>
             </w:pPr>
             <w:r>
+              <w:t>5.</w:t>
+            </w:r>
+            <w:r>
+              <w:t>7</w:t>
+            </w:r>
+            <w:r>
+              <w:t>.1</w:t>
+            </w:r>
+          </w:p>
+        </w:tc>
+        <w:tc>
+          <w:tcPr>
+            <w:tcW w:w="8180" w:type="dxa"/>
+          </w:tcPr>
+          <w:p>
+            <w:pPr>
+              <w:spacing w:line="480" w:lineRule="auto"/>
+            </w:pPr>
+            <w:r>
+              <w:t>Give the state government read access to the data.</w:t>
+            </w:r>
+          </w:p>
+        </w:tc>
+      </w:tr>
+      <w:tr>
+        <w:tc>
+          <w:tcPr>
+            <w:tcW w:w="1170" w:type="dxa"/>
+          </w:tcPr>
+          <w:p>
+            <w:pPr>
+              <w:spacing w:line="480" w:lineRule="auto"/>
+            </w:pPr>
+            <w:r>
               <w:lastRenderedPageBreak/>
-              <w:t>5.8.1</w:t>
-            </w:r>
-          </w:p>
-        </w:tc>
-        <w:tc>
-          <w:tcPr>
-            <w:tcW w:w="8180" w:type="dxa"/>
-          </w:tcPr>
-          <w:p>
-            <w:pPr>
-              <w:spacing w:line="480" w:lineRule="auto"/>
-            </w:pPr>
-            <w:r>
-              <w:t>Give the state government read access to the data.</w:t>
-            </w:r>
-          </w:p>
-        </w:tc>
-      </w:tr>
-      <w:tr>
-        <w:tc>
-          <w:tcPr>
-            <w:tcW w:w="1170" w:type="dxa"/>
-          </w:tcPr>
-          <w:p>
-            <w:pPr>
-              <w:spacing w:line="480" w:lineRule="auto"/>
-            </w:pPr>
-            <w:r>
-              <w:t>5.8.2</w:t>
+              <w:t>5.</w:t>
+            </w:r>
+            <w:r>
+              <w:t>7</w:t>
+            </w:r>
+            <w:r>
+              <w:t>.2</w:t>
             </w:r>
           </w:p>
         </w:tc>
@@ -5968,7 +6066,13 @@
               <w:spacing w:line="480" w:lineRule="auto"/>
             </w:pPr>
             <w:r>
-              <w:t>5.8.3</w:t>
+              <w:t>5.</w:t>
+            </w:r>
+            <w:r>
+              <w:t>7</w:t>
+            </w:r>
+            <w:r>
+              <w:t>.3</w:t>
             </w:r>
           </w:p>
         </w:tc>
@@ -5996,7 +6100,13 @@
               <w:spacing w:line="480" w:lineRule="auto"/>
             </w:pPr>
             <w:r>
-              <w:t>5.8.4</w:t>
+              <w:t>5.</w:t>
+            </w:r>
+            <w:r>
+              <w:t>7</w:t>
+            </w:r>
+            <w:r>
+              <w:t>.4</w:t>
             </w:r>
           </w:p>
         </w:tc>
@@ -6024,7 +6134,13 @@
               <w:spacing w:line="480" w:lineRule="auto"/>
             </w:pPr>
             <w:r>
-              <w:t>5.8.5</w:t>
+              <w:t>5.</w:t>
+            </w:r>
+            <w:r>
+              <w:t>7</w:t>
+            </w:r>
+            <w:r>
+              <w:t>.5</w:t>
             </w:r>
           </w:p>
         </w:tc>
@@ -6052,7 +6168,10 @@
               <w:spacing w:line="480" w:lineRule="auto"/>
             </w:pPr>
             <w:r>
-              <w:t>5.9</w:t>
+              <w:t>5.</w:t>
+            </w:r>
+            <w:r>
+              <w:t>8</w:t>
             </w:r>
           </w:p>
         </w:tc>
@@ -6080,7 +6199,13 @@
               <w:spacing w:line="480" w:lineRule="auto"/>
             </w:pPr>
             <w:r>
-              <w:t>5.9.1</w:t>
+              <w:t>5.</w:t>
+            </w:r>
+            <w:r>
+              <w:t>8</w:t>
+            </w:r>
+            <w:r>
+              <w:t>.1</w:t>
             </w:r>
           </w:p>
         </w:tc>
@@ -6108,35 +6233,52 @@
               <w:spacing w:line="480" w:lineRule="auto"/>
             </w:pPr>
             <w:r>
-              <w:t>5.10</w:t>
-            </w:r>
-          </w:p>
-        </w:tc>
-        <w:tc>
-          <w:tcPr>
-            <w:tcW w:w="8180" w:type="dxa"/>
-          </w:tcPr>
-          <w:p>
-            <w:pPr>
-              <w:spacing w:line="480" w:lineRule="auto"/>
-            </w:pPr>
-            <w:r>
-              <w:t>The chaincode must:</w:t>
-            </w:r>
-          </w:p>
-        </w:tc>
-      </w:tr>
-      <w:tr>
-        <w:tc>
-          <w:tcPr>
-            <w:tcW w:w="1170" w:type="dxa"/>
-          </w:tcPr>
-          <w:p>
-            <w:pPr>
-              <w:spacing w:line="480" w:lineRule="auto"/>
-            </w:pPr>
-            <w:r>
-              <w:t>5.10.1</w:t>
+              <w:t>5.</w:t>
+            </w:r>
+            <w:r>
+              <w:t>9</w:t>
+            </w:r>
+          </w:p>
+        </w:tc>
+        <w:tc>
+          <w:tcPr>
+            <w:tcW w:w="8180" w:type="dxa"/>
+          </w:tcPr>
+          <w:p>
+            <w:pPr>
+              <w:spacing w:line="480" w:lineRule="auto"/>
+            </w:pPr>
+            <w:r>
+              <w:t xml:space="preserve">The </w:t>
+            </w:r>
+            <w:proofErr w:type="spellStart"/>
+            <w:r>
+              <w:t>chaincode</w:t>
+            </w:r>
+            <w:proofErr w:type="spellEnd"/>
+            <w:r>
+              <w:t xml:space="preserve"> must:</w:t>
+            </w:r>
+          </w:p>
+        </w:tc>
+      </w:tr>
+      <w:tr>
+        <w:tc>
+          <w:tcPr>
+            <w:tcW w:w="1170" w:type="dxa"/>
+          </w:tcPr>
+          <w:p>
+            <w:pPr>
+              <w:spacing w:line="480" w:lineRule="auto"/>
+            </w:pPr>
+            <w:r>
+              <w:t>5.</w:t>
+            </w:r>
+            <w:r>
+              <w:t>9</w:t>
+            </w:r>
+            <w:r>
+              <w:t>.1</w:t>
             </w:r>
           </w:p>
         </w:tc>
@@ -6164,7 +6306,13 @@
               <w:spacing w:line="480" w:lineRule="auto"/>
             </w:pPr>
             <w:r>
-              <w:t>5.10.2</w:t>
+              <w:t>5.</w:t>
+            </w:r>
+            <w:r>
+              <w:t>9</w:t>
+            </w:r>
+            <w:r>
+              <w:t>.2</w:t>
             </w:r>
           </w:p>
         </w:tc>
@@ -6192,7 +6340,13 @@
               <w:spacing w:line="480" w:lineRule="auto"/>
             </w:pPr>
             <w:r>
-              <w:t>5.10.3</w:t>
+              <w:t>5.</w:t>
+            </w:r>
+            <w:r>
+              <w:t>9</w:t>
+            </w:r>
+            <w:r>
+              <w:t>.3</w:t>
             </w:r>
           </w:p>
         </w:tc>
@@ -6220,7 +6374,13 @@
               <w:spacing w:line="480" w:lineRule="auto"/>
             </w:pPr>
             <w:r>
-              <w:t>5.10.4</w:t>
+              <w:t>5.</w:t>
+            </w:r>
+            <w:r>
+              <w:t>9</w:t>
+            </w:r>
+            <w:r>
+              <w:t>.4</w:t>
             </w:r>
           </w:p>
         </w:tc>
@@ -6248,7 +6408,10 @@
               <w:spacing w:line="480" w:lineRule="auto"/>
             </w:pPr>
             <w:r>
-              <w:t>5.11</w:t>
+              <w:t>5.</w:t>
+            </w:r>
+            <w:r>
+              <w:t>10</w:t>
             </w:r>
           </w:p>
         </w:tc>
@@ -6276,7 +6439,13 @@
               <w:spacing w:line="480" w:lineRule="auto"/>
             </w:pPr>
             <w:r>
-              <w:t>5.11.1</w:t>
+              <w:t>5.1</w:t>
+            </w:r>
+            <w:r>
+              <w:t>0</w:t>
+            </w:r>
+            <w:r>
+              <w:t>.1</w:t>
             </w:r>
           </w:p>
         </w:tc>
@@ -6304,7 +6473,13 @@
               <w:spacing w:line="480" w:lineRule="auto"/>
             </w:pPr>
             <w:r>
-              <w:t>5.11.2</w:t>
+              <w:t>5.1</w:t>
+            </w:r>
+            <w:r>
+              <w:t>0</w:t>
+            </w:r>
+            <w:r>
+              <w:t>.2</w:t>
             </w:r>
           </w:p>
         </w:tc>
@@ -6466,7 +6641,6 @@
               <w:spacing w:line="480" w:lineRule="auto"/>
             </w:pPr>
             <w:r>
-              <w:lastRenderedPageBreak/>
               <w:t>6.3</w:t>
             </w:r>
           </w:p>
@@ -6524,6 +6698,7 @@
               <w:spacing w:line="480" w:lineRule="auto"/>
             </w:pPr>
             <w:r>
+              <w:lastRenderedPageBreak/>
               <w:t>6.4</w:t>
             </w:r>
           </w:p>
@@ -6593,7 +6768,15 @@
               <w:spacing w:line="480" w:lineRule="auto"/>
             </w:pPr>
             <w:r>
-              <w:t>The licensee’s photohraph.</w:t>
+              <w:t xml:space="preserve">The licensee’s </w:t>
+            </w:r>
+            <w:proofErr w:type="spellStart"/>
+            <w:r>
+              <w:t>photohraph</w:t>
+            </w:r>
+            <w:proofErr w:type="spellEnd"/>
+            <w:r>
+              <w:t>.</w:t>
             </w:r>
           </w:p>
         </w:tc>
@@ -6985,7 +7168,15 @@
               <w:spacing w:line="480" w:lineRule="auto"/>
             </w:pPr>
             <w:r>
-              <w:t>The chaincode must:</w:t>
+              <w:t xml:space="preserve">The </w:t>
+            </w:r>
+            <w:proofErr w:type="spellStart"/>
+            <w:r>
+              <w:t>chaincode</w:t>
+            </w:r>
+            <w:proofErr w:type="spellEnd"/>
+            <w:r>
+              <w:t xml:space="preserve"> must:</w:t>
             </w:r>
           </w:p>
         </w:tc>
@@ -7056,63 +7247,63 @@
               <w:spacing w:line="480" w:lineRule="auto"/>
             </w:pPr>
             <w:r>
+              <w:t>6.9.3</w:t>
+            </w:r>
+          </w:p>
+        </w:tc>
+        <w:tc>
+          <w:tcPr>
+            <w:tcW w:w="8180" w:type="dxa"/>
+          </w:tcPr>
+          <w:p>
+            <w:pPr>
+              <w:spacing w:line="480" w:lineRule="auto"/>
+            </w:pPr>
+            <w:r>
+              <w:t>Allow authorized participants to retrieve an entry.</w:t>
+            </w:r>
+          </w:p>
+        </w:tc>
+      </w:tr>
+      <w:tr>
+        <w:tc>
+          <w:tcPr>
+            <w:tcW w:w="1170" w:type="dxa"/>
+          </w:tcPr>
+          <w:p>
+            <w:pPr>
+              <w:spacing w:line="480" w:lineRule="auto"/>
+            </w:pPr>
+            <w:r>
+              <w:t>6.9.4</w:t>
+            </w:r>
+          </w:p>
+        </w:tc>
+        <w:tc>
+          <w:tcPr>
+            <w:tcW w:w="8180" w:type="dxa"/>
+          </w:tcPr>
+          <w:p>
+            <w:pPr>
+              <w:spacing w:line="480" w:lineRule="auto"/>
+            </w:pPr>
+            <w:r>
+              <w:t>Allow authorized participants to write an entry.</w:t>
+            </w:r>
+          </w:p>
+        </w:tc>
+      </w:tr>
+      <w:tr>
+        <w:tc>
+          <w:tcPr>
+            <w:tcW w:w="1170" w:type="dxa"/>
+          </w:tcPr>
+          <w:p>
+            <w:pPr>
+              <w:spacing w:line="480" w:lineRule="auto"/>
+            </w:pPr>
+            <w:r>
               <w:lastRenderedPageBreak/>
-              <w:t>6.9.3</w:t>
-            </w:r>
-          </w:p>
-        </w:tc>
-        <w:tc>
-          <w:tcPr>
-            <w:tcW w:w="8180" w:type="dxa"/>
-          </w:tcPr>
-          <w:p>
-            <w:pPr>
-              <w:spacing w:line="480" w:lineRule="auto"/>
-            </w:pPr>
-            <w:r>
-              <w:t>Allow authorized participants to retrieve an entry.</w:t>
-            </w:r>
-          </w:p>
-        </w:tc>
-      </w:tr>
-      <w:tr>
-        <w:tc>
-          <w:tcPr>
-            <w:tcW w:w="1170" w:type="dxa"/>
-          </w:tcPr>
-          <w:p>
-            <w:pPr>
-              <w:spacing w:line="480" w:lineRule="auto"/>
-            </w:pPr>
-            <w:r>
-              <w:t>6.9.4</w:t>
-            </w:r>
-          </w:p>
-        </w:tc>
-        <w:tc>
-          <w:tcPr>
-            <w:tcW w:w="8180" w:type="dxa"/>
-          </w:tcPr>
-          <w:p>
-            <w:pPr>
-              <w:spacing w:line="480" w:lineRule="auto"/>
-            </w:pPr>
-            <w:r>
-              <w:t>Allow authorized participants to write an entry.</w:t>
-            </w:r>
-          </w:p>
-        </w:tc>
-      </w:tr>
-      <w:tr>
-        <w:tc>
-          <w:tcPr>
-            <w:tcW w:w="1170" w:type="dxa"/>
-          </w:tcPr>
-          <w:p>
-            <w:pPr>
-              <w:spacing w:line="480" w:lineRule="auto"/>
-            </w:pPr>
-            <w:r>
               <w:t>6.10</w:t>
             </w:r>
           </w:p>
@@ -7668,63 +7859,71 @@
               <w:spacing w:line="480" w:lineRule="auto"/>
             </w:pPr>
             <w:r>
+              <w:t>7.8.1</w:t>
+            </w:r>
+          </w:p>
+        </w:tc>
+        <w:tc>
+          <w:tcPr>
+            <w:tcW w:w="8180" w:type="dxa"/>
+          </w:tcPr>
+          <w:p>
+            <w:pPr>
+              <w:spacing w:line="480" w:lineRule="auto"/>
+            </w:pPr>
+            <w:r>
+              <w:t>Grant read access may be granted to other parties.</w:t>
+            </w:r>
+          </w:p>
+        </w:tc>
+      </w:tr>
+      <w:tr>
+        <w:tc>
+          <w:tcPr>
+            <w:tcW w:w="1170" w:type="dxa"/>
+          </w:tcPr>
+          <w:p>
+            <w:pPr>
+              <w:spacing w:line="480" w:lineRule="auto"/>
+            </w:pPr>
+            <w:r>
+              <w:t>7.9</w:t>
+            </w:r>
+          </w:p>
+        </w:tc>
+        <w:tc>
+          <w:tcPr>
+            <w:tcW w:w="8180" w:type="dxa"/>
+          </w:tcPr>
+          <w:p>
+            <w:pPr>
+              <w:spacing w:line="480" w:lineRule="auto"/>
+            </w:pPr>
+            <w:r>
+              <w:t xml:space="preserve">The </w:t>
+            </w:r>
+            <w:proofErr w:type="spellStart"/>
+            <w:r>
+              <w:t>chaincode</w:t>
+            </w:r>
+            <w:proofErr w:type="spellEnd"/>
+            <w:r>
+              <w:t xml:space="preserve"> must:</w:t>
+            </w:r>
+          </w:p>
+        </w:tc>
+      </w:tr>
+      <w:tr>
+        <w:tc>
+          <w:tcPr>
+            <w:tcW w:w="1170" w:type="dxa"/>
+          </w:tcPr>
+          <w:p>
+            <w:pPr>
+              <w:spacing w:line="480" w:lineRule="auto"/>
+            </w:pPr>
+            <w:r>
               <w:lastRenderedPageBreak/>
-              <w:t>7.8.1</w:t>
-            </w:r>
-          </w:p>
-        </w:tc>
-        <w:tc>
-          <w:tcPr>
-            <w:tcW w:w="8180" w:type="dxa"/>
-          </w:tcPr>
-          <w:p>
-            <w:pPr>
-              <w:spacing w:line="480" w:lineRule="auto"/>
-            </w:pPr>
-            <w:r>
-              <w:t>Grant read access may be granted to other parties.</w:t>
-            </w:r>
-          </w:p>
-        </w:tc>
-      </w:tr>
-      <w:tr>
-        <w:tc>
-          <w:tcPr>
-            <w:tcW w:w="1170" w:type="dxa"/>
-          </w:tcPr>
-          <w:p>
-            <w:pPr>
-              <w:spacing w:line="480" w:lineRule="auto"/>
-            </w:pPr>
-            <w:r>
-              <w:t>7.9</w:t>
-            </w:r>
-          </w:p>
-        </w:tc>
-        <w:tc>
-          <w:tcPr>
-            <w:tcW w:w="8180" w:type="dxa"/>
-          </w:tcPr>
-          <w:p>
-            <w:pPr>
-              <w:spacing w:line="480" w:lineRule="auto"/>
-            </w:pPr>
-            <w:r>
-              <w:t>The chaincode must:</w:t>
-            </w:r>
-          </w:p>
-        </w:tc>
-      </w:tr>
-      <w:tr>
-        <w:tc>
-          <w:tcPr>
-            <w:tcW w:w="1170" w:type="dxa"/>
-          </w:tcPr>
-          <w:p>
-            <w:pPr>
-              <w:spacing w:line="480" w:lineRule="auto"/>
-            </w:pPr>
-            <w:r>
               <w:t>7.9.1</w:t>
             </w:r>
           </w:p>

</xml_diff>